<commit_message>
v1.1: Agregado sistema de Kardex y Recepcion de Fabriquines
</commit_message>
<xml_diff>
--- a/📖 Bitácora de Desarrollo.docx
+++ b/📖 Bitácora de Desarrollo.docx
@@ -69,7 +69,7 @@
     <w:p>
       <w:r>
         <w:pict w14:anchorId="2CD400CD">
-          <v:rect id="_x0000_i1067" style="width:0;height:1.5pt" o:hralign="center" o:hrstd="t" o:hr="t" fillcolor="#a0a0a0" stroked="f"/>
+          <v:rect id="_x0000_i1025" style="width:0;height:1.5pt" o:hralign="center" o:hrstd="t" o:hr="t" fillcolor="#a0a0a0" stroked="f"/>
         </w:pict>
       </w:r>
     </w:p>
@@ -102,6 +102,7 @@
       </w:pPr>
       <w:r>
         <w:rPr>
+          <w:noProof/>
           <w:lang w:val="es-CO"/>
         </w:rPr>
         <w:drawing>
@@ -159,6 +160,7 @@
       </w:pPr>
       <w:r>
         <w:rPr>
+          <w:noProof/>
           <w:lang w:val="es-CO"/>
         </w:rPr>
         <w:lastRenderedPageBreak/>
@@ -210,6 +212,7 @@
       </w:r>
       <w:r>
         <w:rPr>
+          <w:noProof/>
           <w:lang w:val="es-CO"/>
         </w:rPr>
         <w:drawing>
@@ -260,6 +263,7 @@
       </w:pPr>
       <w:r>
         <w:rPr>
+          <w:noProof/>
           <w:lang w:val="es-CO"/>
         </w:rPr>
         <w:lastRenderedPageBreak/>
@@ -311,6 +315,7 @@
       </w:pPr>
       <w:r>
         <w:rPr>
+          <w:noProof/>
           <w:lang w:val="es-CO"/>
         </w:rPr>
         <w:drawing>
@@ -367,6 +372,7 @@
       </w:r>
       <w:r>
         <w:rPr>
+          <w:noProof/>
           <w:lang w:val="es-CO"/>
         </w:rPr>
         <w:drawing>
@@ -417,6 +423,7 @@
       </w:pPr>
       <w:r>
         <w:rPr>
+          <w:noProof/>
           <w:lang w:val="es-CO"/>
         </w:rPr>
         <w:lastRenderedPageBreak/>
@@ -475,6 +482,7 @@
       </w:pPr>
       <w:r>
         <w:rPr>
+          <w:noProof/>
           <w:lang w:val="es-CO"/>
         </w:rPr>
         <w:drawing>
@@ -540,7 +548,7 @@
     <w:p>
       <w:r>
         <w:pict w14:anchorId="5C2F959B">
-          <v:rect id="_x0000_i1068" style="width:0;height:1.5pt" o:hralign="center" o:hrstd="t" o:hr="t" fillcolor="#a0a0a0" stroked="f"/>
+          <v:rect id="_x0000_i1026" style="width:0;height:1.5pt" o:hralign="center" o:hrstd="t" o:hr="t" fillcolor="#a0a0a0" stroked="f"/>
         </w:pict>
       </w:r>
     </w:p>
@@ -603,7 +611,7 @@
     <w:p>
       <w:pPr>
         <w:rPr>
-          <w:lang w:val="en-US"/>
+          <w:lang w:val="es-CO"/>
         </w:rPr>
       </w:pPr>
       <w:r>
@@ -643,18 +651,19 @@
     <w:p>
       <w:pPr>
         <w:rPr>
+          <w:lang w:val="es-CO"/>
+        </w:rPr>
+      </w:pPr>
+    </w:p>
+    <w:p>
+      <w:pPr>
+        <w:rPr>
           <w:lang w:val="en-US"/>
         </w:rPr>
       </w:pPr>
-    </w:p>
-    <w:p>
-      <w:pPr>
-        <w:rPr>
-          <w:lang w:val="en-US"/>
-        </w:rPr>
-      </w:pPr>
-      <w:r>
-        <w:rPr>
+      <w:r>
+        <w:rPr>
+          <w:noProof/>
           <w:lang w:val="es-CO"/>
         </w:rPr>
         <w:lastRenderedPageBreak/>
@@ -919,7 +928,7 @@
       <w:r>
         <w:lastRenderedPageBreak/>
         <w:pict w14:anchorId="288B530C">
-          <v:rect id="_x0000_i1069" style="width:0;height:1.5pt" o:hralign="center" o:hrstd="t" o:hr="t" fillcolor="#a0a0a0" stroked="f"/>
+          <v:rect id="_x0000_i1027" style="width:0;height:1.5pt" o:hralign="center" o:hrstd="t" o:hr="t" fillcolor="#a0a0a0" stroked="f"/>
         </w:pict>
       </w:r>
     </w:p>
@@ -1402,7 +1411,7 @@
     <w:p>
       <w:r>
         <w:pict w14:anchorId="03FDB0E1">
-          <v:rect id="_x0000_i1070" style="width:0;height:1.5pt" o:hralign="center" o:hrstd="t" o:hr="t" fillcolor="#a0a0a0" stroked="f"/>
+          <v:rect id="_x0000_i1028" style="width:0;height:1.5pt" o:hralign="center" o:hrstd="t" o:hr="t" fillcolor="#a0a0a0" stroked="f"/>
         </w:pict>
       </w:r>
     </w:p>
@@ -1452,26 +1461,15 @@
       </w:r>
     </w:p>
     <w:p>
-      <w:pPr>
-        <w:rPr>
-          <w:lang w:val="en-US"/>
-        </w:rPr>
-      </w:pPr>
       <w:r>
         <w:t>&lt;img src="/img/logo.png" class="logo"&gt;</w:t>
       </w:r>
     </w:p>
-    <w:p>
-      <w:pPr>
-        <w:rPr>
-          <w:lang w:val="en-US"/>
-        </w:rPr>
-      </w:pPr>
-    </w:p>
+    <w:p/>
     <w:p>
       <w:r>
         <w:pict w14:anchorId="36776016">
-          <v:rect id="_x0000_i1071" style="width:0;height:1.5pt" o:hralign="center" o:hrstd="t" o:hr="t" fillcolor="#a0a0a0" stroked="f"/>
+          <v:rect id="_x0000_i1029" style="width:0;height:1.5pt" o:hralign="center" o:hrstd="t" o:hr="t" fillcolor="#a0a0a0" stroked="f"/>
         </w:pict>
       </w:r>
     </w:p>
@@ -1509,7 +1507,7 @@
     <w:p>
       <w:pPr>
         <w:rPr>
-          <w:lang w:val="en-US"/>
+          <w:lang w:val="es-CO"/>
         </w:rPr>
       </w:pPr>
       <w:r>
@@ -1539,7 +1537,7 @@
           <w:lang w:val="en-US"/>
         </w:rPr>
         <w:drawing>
-          <wp:inline distT="0" distB="0" distL="0" distR="0" wp14:anchorId="06CF26DC" wp14:editId="652147CB">
+          <wp:inline distT="0" distB="0" distL="0" distR="0" wp14:anchorId="06CF26DC" wp14:editId="480AAC85">
             <wp:extent cx="5731510" cy="3344957"/>
             <wp:effectExtent l="0" t="0" r="2540" b="8255"/>
             <wp:docPr id="282286394" name="Imagen 6"/>
@@ -1732,7 +1730,7 @@
     <w:p>
       <w:r>
         <w:pict w14:anchorId="1CADF640">
-          <v:rect id="_x0000_i1072" style="width:0;height:1.5pt" o:hralign="center" o:hrstd="t" o:hr="t" fillcolor="#a0a0a0" stroked="f"/>
+          <v:rect id="_x0000_i1030" style="width:0;height:1.5pt" o:hralign="center" o:hrstd="t" o:hr="t" fillcolor="#a0a0a0" stroked="f"/>
         </w:pict>
       </w:r>
     </w:p>
@@ -1994,7 +1992,7 @@
     <w:p>
       <w:r>
         <w:pict w14:anchorId="58CCA8F3">
-          <v:rect id="_x0000_i1073" style="width:0;height:1.5pt" o:hralign="center" o:hrstd="t" o:hr="t" fillcolor="#a0a0a0" stroked="f"/>
+          <v:rect id="_x0000_i1031" style="width:0;height:1.5pt" o:hralign="center" o:hrstd="t" o:hr="t" fillcolor="#a0a0a0" stroked="f"/>
         </w:pict>
       </w:r>
     </w:p>
@@ -2051,7 +2049,7 @@
     <w:p>
       <w:pPr>
         <w:rPr>
-          <w:lang w:val="en-US"/>
+          <w:lang w:val="es-CO"/>
         </w:rPr>
       </w:pPr>
       <w:r>
@@ -2143,7 +2141,7 @@
         </w:rPr>
         <w:lastRenderedPageBreak/>
         <w:drawing>
-          <wp:inline distT="0" distB="0" distL="0" distR="0" wp14:anchorId="45040CB5" wp14:editId="4EAA8BFD">
+          <wp:inline distT="0" distB="0" distL="0" distR="0" wp14:anchorId="45040CB5" wp14:editId="0BC2B79D">
             <wp:extent cx="5629015" cy="2992228"/>
             <wp:effectExtent l="0" t="0" r="0" b="0"/>
             <wp:docPr id="1438918074" name="Imagen 10"/>
@@ -2540,7 +2538,7 @@
         <w:rPr>
           <w:b/>
           <w:bCs/>
-          <w:lang w:val="en-US"/>
+          <w:lang w:val="es-CO"/>
         </w:rPr>
       </w:pPr>
     </w:p>
@@ -2549,7 +2547,7 @@
         <w:rPr>
           <w:b/>
           <w:bCs/>
-          <w:lang w:val="en-US"/>
+          <w:lang w:val="es-CO"/>
         </w:rPr>
       </w:pPr>
     </w:p>
@@ -2558,7 +2556,7 @@
         <w:rPr>
           <w:b/>
           <w:bCs/>
-          <w:lang w:val="en-US"/>
+          <w:lang w:val="es-CO"/>
         </w:rPr>
       </w:pPr>
     </w:p>
@@ -2567,7 +2565,7 @@
         <w:rPr>
           <w:b/>
           <w:bCs/>
-          <w:lang w:val="en-US"/>
+          <w:lang w:val="es-CO"/>
         </w:rPr>
       </w:pPr>
     </w:p>
@@ -2595,7 +2593,7 @@
     <w:p>
       <w:pPr>
         <w:rPr>
-          <w:lang w:val="en-US"/>
+          <w:lang w:val="es-CO"/>
         </w:rPr>
       </w:pPr>
       <w:r>
@@ -2627,6 +2625,7 @@
       </w:pPr>
       <w:r>
         <w:rPr>
+          <w:noProof/>
           <w:lang w:val="en-US"/>
         </w:rPr>
         <w:drawing>
@@ -2705,6 +2704,7 @@
       </w:r>
       <w:r>
         <w:rPr>
+          <w:noProof/>
           <w:lang w:val="en-US"/>
         </w:rPr>
         <w:drawing>
@@ -2747,7 +2747,7 @@
     <w:p>
       <w:pPr>
         <w:rPr>
-          <w:lang w:val="en-US"/>
+          <w:lang w:val="es-CO"/>
         </w:rPr>
       </w:pPr>
     </w:p>
@@ -2772,6 +2772,7 @@
       </w:pPr>
       <w:r>
         <w:rPr>
+          <w:noProof/>
           <w:lang w:val="en-US"/>
         </w:rPr>
         <w:lastRenderedPageBreak/>
@@ -2830,7 +2831,7 @@
     <w:p>
       <w:pPr>
         <w:rPr>
-          <w:lang w:val="en-US"/>
+          <w:lang w:val="es-CO"/>
         </w:rPr>
       </w:pPr>
       <w:r>
@@ -2897,6 +2898,7 @@
       </w:pPr>
       <w:r>
         <w:rPr>
+          <w:noProof/>
           <w:lang w:val="en-US"/>
         </w:rPr>
         <w:drawing>
@@ -3011,7 +3013,7 @@
     <w:p>
       <w:r>
         <w:pict w14:anchorId="34E72F78">
-          <v:rect id="_x0000_i1099" style="width:0;height:1.5pt" o:hralign="center" o:hrstd="t" o:hr="t" fillcolor="#a0a0a0" stroked="f"/>
+          <v:rect id="_x0000_i1032" style="width:0;height:1.5pt" o:hralign="center" o:hrstd="t" o:hr="t" fillcolor="#a0a0a0" stroked="f"/>
         </w:pict>
       </w:r>
     </w:p>
@@ -4120,7 +4122,7 @@
           <w:lang w:val="en-US"/>
         </w:rPr>
         <w:drawing>
-          <wp:inline distT="0" distB="0" distL="0" distR="0" wp14:anchorId="79BD094D" wp14:editId="5E07181F">
+          <wp:inline distT="0" distB="0" distL="0" distR="0" wp14:anchorId="79BD094D" wp14:editId="24D7F445">
             <wp:extent cx="5754168" cy="1143000"/>
             <wp:effectExtent l="0" t="0" r="0" b="0"/>
             <wp:docPr id="1133662101" name="Imagen 4"/>
@@ -4188,6 +4190,7 @@
       </w:pPr>
       <w:r>
         <w:rPr>
+          <w:noProof/>
           <w:lang w:val="en-US"/>
         </w:rPr>
         <w:drawing>
@@ -4215,6 +4218,371 @@
                     <a:xfrm>
                       <a:off x="0" y="0"/>
                       <a:ext cx="5731510" cy="1289685"/>
+                    </a:xfrm>
+                    <a:prstGeom prst="rect">
+                      <a:avLst/>
+                    </a:prstGeom>
+                  </pic:spPr>
+                </pic:pic>
+              </a:graphicData>
+            </a:graphic>
+          </wp:inline>
+        </w:drawing>
+      </w:r>
+    </w:p>
+    <w:p>
+      <w:pPr>
+        <w:rPr>
+          <w:lang w:val="en-US"/>
+        </w:rPr>
+      </w:pPr>
+      <w:r>
+        <w:rPr>
+          <w:noProof/>
+          <w:lang w:val="en-US"/>
+        </w:rPr>
+        <w:lastRenderedPageBreak/>
+        <w:drawing>
+          <wp:inline distT="0" distB="0" distL="0" distR="0" wp14:anchorId="007358FC" wp14:editId="1F4CFAA1">
+            <wp:extent cx="5731510" cy="2774315"/>
+            <wp:effectExtent l="0" t="0" r="2540" b="6985"/>
+            <wp:docPr id="1709956117" name="Imagen 1"/>
+            <wp:cNvGraphicFramePr>
+              <a:graphicFrameLocks xmlns:a="http://schemas.openxmlformats.org/drawingml/2006/main" noChangeAspect="1"/>
+            </wp:cNvGraphicFramePr>
+            <a:graphic xmlns:a="http://schemas.openxmlformats.org/drawingml/2006/main">
+              <a:graphicData uri="http://schemas.openxmlformats.org/drawingml/2006/picture">
+                <pic:pic xmlns:pic="http://schemas.openxmlformats.org/drawingml/2006/picture">
+                  <pic:nvPicPr>
+                    <pic:cNvPr id="1709956117" name=""/>
+                    <pic:cNvPicPr/>
+                  </pic:nvPicPr>
+                  <pic:blipFill>
+                    <a:blip r:embed="rId25"/>
+                    <a:stretch>
+                      <a:fillRect/>
+                    </a:stretch>
+                  </pic:blipFill>
+                  <pic:spPr>
+                    <a:xfrm>
+                      <a:off x="0" y="0"/>
+                      <a:ext cx="5731510" cy="2774315"/>
+                    </a:xfrm>
+                    <a:prstGeom prst="rect">
+                      <a:avLst/>
+                    </a:prstGeom>
+                  </pic:spPr>
+                </pic:pic>
+              </a:graphicData>
+            </a:graphic>
+          </wp:inline>
+        </w:drawing>
+      </w:r>
+    </w:p>
+    <w:p>
+      <w:pPr>
+        <w:rPr>
+          <w:lang w:val="en-US"/>
+        </w:rPr>
+      </w:pPr>
+      <w:r>
+        <w:rPr>
+          <w:noProof/>
+          <w:lang w:val="en-US"/>
+        </w:rPr>
+        <w:drawing>
+          <wp:inline distT="0" distB="0" distL="0" distR="0" wp14:anchorId="63A7F1C0" wp14:editId="667EBC84">
+            <wp:extent cx="5731510" cy="3265170"/>
+            <wp:effectExtent l="0" t="0" r="2540" b="0"/>
+            <wp:docPr id="530410882" name="Imagen 1"/>
+            <wp:cNvGraphicFramePr>
+              <a:graphicFrameLocks xmlns:a="http://schemas.openxmlformats.org/drawingml/2006/main" noChangeAspect="1"/>
+            </wp:cNvGraphicFramePr>
+            <a:graphic xmlns:a="http://schemas.openxmlformats.org/drawingml/2006/main">
+              <a:graphicData uri="http://schemas.openxmlformats.org/drawingml/2006/picture">
+                <pic:pic xmlns:pic="http://schemas.openxmlformats.org/drawingml/2006/picture">
+                  <pic:nvPicPr>
+                    <pic:cNvPr id="530410882" name=""/>
+                    <pic:cNvPicPr/>
+                  </pic:nvPicPr>
+                  <pic:blipFill>
+                    <a:blip r:embed="rId26"/>
+                    <a:stretch>
+                      <a:fillRect/>
+                    </a:stretch>
+                  </pic:blipFill>
+                  <pic:spPr>
+                    <a:xfrm>
+                      <a:off x="0" y="0"/>
+                      <a:ext cx="5731510" cy="3265170"/>
+                    </a:xfrm>
+                    <a:prstGeom prst="rect">
+                      <a:avLst/>
+                    </a:prstGeom>
+                  </pic:spPr>
+                </pic:pic>
+              </a:graphicData>
+            </a:graphic>
+          </wp:inline>
+        </w:drawing>
+      </w:r>
+    </w:p>
+    <w:p>
+      <w:pPr>
+        <w:rPr>
+          <w:lang w:val="en-US"/>
+        </w:rPr>
+      </w:pPr>
+      <w:r>
+        <w:rPr>
+          <w:lang w:val="en-US"/>
+        </w:rPr>
+        <w:lastRenderedPageBreak/>
+        <w:drawing>
+          <wp:inline distT="0" distB="0" distL="0" distR="0" wp14:anchorId="573962BB" wp14:editId="161D1BA4">
+            <wp:extent cx="5731510" cy="3195320"/>
+            <wp:effectExtent l="0" t="0" r="2540" b="5080"/>
+            <wp:docPr id="637595892" name="Imagen 1"/>
+            <wp:cNvGraphicFramePr>
+              <a:graphicFrameLocks xmlns:a="http://schemas.openxmlformats.org/drawingml/2006/main" noChangeAspect="1"/>
+            </wp:cNvGraphicFramePr>
+            <a:graphic xmlns:a="http://schemas.openxmlformats.org/drawingml/2006/main">
+              <a:graphicData uri="http://schemas.openxmlformats.org/drawingml/2006/picture">
+                <pic:pic xmlns:pic="http://schemas.openxmlformats.org/drawingml/2006/picture">
+                  <pic:nvPicPr>
+                    <pic:cNvPr id="637595892" name=""/>
+                    <pic:cNvPicPr/>
+                  </pic:nvPicPr>
+                  <pic:blipFill>
+                    <a:blip r:embed="rId27"/>
+                    <a:stretch>
+                      <a:fillRect/>
+                    </a:stretch>
+                  </pic:blipFill>
+                  <pic:spPr>
+                    <a:xfrm>
+                      <a:off x="0" y="0"/>
+                      <a:ext cx="5731510" cy="3195320"/>
+                    </a:xfrm>
+                    <a:prstGeom prst="rect">
+                      <a:avLst/>
+                    </a:prstGeom>
+                  </pic:spPr>
+                </pic:pic>
+              </a:graphicData>
+            </a:graphic>
+          </wp:inline>
+        </w:drawing>
+      </w:r>
+      <w:r>
+        <w:rPr>
+          <w:lang w:val="en-US"/>
+        </w:rPr>
+        <w:drawing>
+          <wp:inline distT="0" distB="0" distL="0" distR="0" wp14:anchorId="706C4C6D" wp14:editId="5DABDA06">
+            <wp:extent cx="5731510" cy="3216275"/>
+            <wp:effectExtent l="0" t="0" r="2540" b="3175"/>
+            <wp:docPr id="237126218" name="Imagen 1"/>
+            <wp:cNvGraphicFramePr>
+              <a:graphicFrameLocks xmlns:a="http://schemas.openxmlformats.org/drawingml/2006/main" noChangeAspect="1"/>
+            </wp:cNvGraphicFramePr>
+            <a:graphic xmlns:a="http://schemas.openxmlformats.org/drawingml/2006/main">
+              <a:graphicData uri="http://schemas.openxmlformats.org/drawingml/2006/picture">
+                <pic:pic xmlns:pic="http://schemas.openxmlformats.org/drawingml/2006/picture">
+                  <pic:nvPicPr>
+                    <pic:cNvPr id="237126218" name=""/>
+                    <pic:cNvPicPr/>
+                  </pic:nvPicPr>
+                  <pic:blipFill>
+                    <a:blip r:embed="rId28"/>
+                    <a:stretch>
+                      <a:fillRect/>
+                    </a:stretch>
+                  </pic:blipFill>
+                  <pic:spPr>
+                    <a:xfrm>
+                      <a:off x="0" y="0"/>
+                      <a:ext cx="5731510" cy="3216275"/>
+                    </a:xfrm>
+                    <a:prstGeom prst="rect">
+                      <a:avLst/>
+                    </a:prstGeom>
+                  </pic:spPr>
+                </pic:pic>
+              </a:graphicData>
+            </a:graphic>
+          </wp:inline>
+        </w:drawing>
+      </w:r>
+    </w:p>
+    <w:p>
+      <w:pPr>
+        <w:rPr>
+          <w:lang w:val="en-US"/>
+        </w:rPr>
+      </w:pPr>
+      <w:r>
+        <w:rPr>
+          <w:noProof/>
+          <w:lang w:val="en-US"/>
+        </w:rPr>
+        <w:lastRenderedPageBreak/>
+        <w:drawing>
+          <wp:inline distT="0" distB="0" distL="0" distR="0" wp14:anchorId="10CB359D" wp14:editId="2703DDE2">
+            <wp:extent cx="5731510" cy="2950845"/>
+            <wp:effectExtent l="0" t="0" r="2540" b="1905"/>
+            <wp:docPr id="1034880870" name="Imagen 1"/>
+            <wp:cNvGraphicFramePr>
+              <a:graphicFrameLocks xmlns:a="http://schemas.openxmlformats.org/drawingml/2006/main" noChangeAspect="1"/>
+            </wp:cNvGraphicFramePr>
+            <a:graphic xmlns:a="http://schemas.openxmlformats.org/drawingml/2006/main">
+              <a:graphicData uri="http://schemas.openxmlformats.org/drawingml/2006/picture">
+                <pic:pic xmlns:pic="http://schemas.openxmlformats.org/drawingml/2006/picture">
+                  <pic:nvPicPr>
+                    <pic:cNvPr id="1034880870" name=""/>
+                    <pic:cNvPicPr/>
+                  </pic:nvPicPr>
+                  <pic:blipFill>
+                    <a:blip r:embed="rId29"/>
+                    <a:stretch>
+                      <a:fillRect/>
+                    </a:stretch>
+                  </pic:blipFill>
+                  <pic:spPr>
+                    <a:xfrm>
+                      <a:off x="0" y="0"/>
+                      <a:ext cx="5731510" cy="2950845"/>
+                    </a:xfrm>
+                    <a:prstGeom prst="rect">
+                      <a:avLst/>
+                    </a:prstGeom>
+                  </pic:spPr>
+                </pic:pic>
+              </a:graphicData>
+            </a:graphic>
+          </wp:inline>
+        </w:drawing>
+      </w:r>
+    </w:p>
+    <w:p>
+      <w:pPr>
+        <w:rPr>
+          <w:lang w:val="en-US"/>
+        </w:rPr>
+      </w:pPr>
+      <w:r>
+        <w:rPr>
+          <w:noProof/>
+          <w:lang w:val="en-US"/>
+        </w:rPr>
+        <w:lastRenderedPageBreak/>
+        <w:drawing>
+          <wp:inline distT="0" distB="0" distL="0" distR="0" wp14:anchorId="4882C00A" wp14:editId="52876CFE">
+            <wp:extent cx="5731510" cy="3197860"/>
+            <wp:effectExtent l="0" t="0" r="2540" b="2540"/>
+            <wp:docPr id="1007215877" name="Imagen 1"/>
+            <wp:cNvGraphicFramePr>
+              <a:graphicFrameLocks xmlns:a="http://schemas.openxmlformats.org/drawingml/2006/main" noChangeAspect="1"/>
+            </wp:cNvGraphicFramePr>
+            <a:graphic xmlns:a="http://schemas.openxmlformats.org/drawingml/2006/main">
+              <a:graphicData uri="http://schemas.openxmlformats.org/drawingml/2006/picture">
+                <pic:pic xmlns:pic="http://schemas.openxmlformats.org/drawingml/2006/picture">
+                  <pic:nvPicPr>
+                    <pic:cNvPr id="1007215877" name=""/>
+                    <pic:cNvPicPr/>
+                  </pic:nvPicPr>
+                  <pic:blipFill>
+                    <a:blip r:embed="rId30"/>
+                    <a:stretch>
+                      <a:fillRect/>
+                    </a:stretch>
+                  </pic:blipFill>
+                  <pic:spPr>
+                    <a:xfrm>
+                      <a:off x="0" y="0"/>
+                      <a:ext cx="5731510" cy="3197860"/>
+                    </a:xfrm>
+                    <a:prstGeom prst="rect">
+                      <a:avLst/>
+                    </a:prstGeom>
+                  </pic:spPr>
+                </pic:pic>
+              </a:graphicData>
+            </a:graphic>
+          </wp:inline>
+        </w:drawing>
+      </w:r>
+      <w:r>
+        <w:rPr>
+          <w:noProof/>
+          <w:lang w:val="en-US"/>
+        </w:rPr>
+        <w:drawing>
+          <wp:inline distT="0" distB="0" distL="0" distR="0" wp14:anchorId="7A4A381B" wp14:editId="72DBC663">
+            <wp:extent cx="5731510" cy="2313940"/>
+            <wp:effectExtent l="0" t="0" r="2540" b="0"/>
+            <wp:docPr id="1820246416" name="Imagen 1"/>
+            <wp:cNvGraphicFramePr>
+              <a:graphicFrameLocks xmlns:a="http://schemas.openxmlformats.org/drawingml/2006/main" noChangeAspect="1"/>
+            </wp:cNvGraphicFramePr>
+            <a:graphic xmlns:a="http://schemas.openxmlformats.org/drawingml/2006/main">
+              <a:graphicData uri="http://schemas.openxmlformats.org/drawingml/2006/picture">
+                <pic:pic xmlns:pic="http://schemas.openxmlformats.org/drawingml/2006/picture">
+                  <pic:nvPicPr>
+                    <pic:cNvPr id="1820246416" name=""/>
+                    <pic:cNvPicPr/>
+                  </pic:nvPicPr>
+                  <pic:blipFill>
+                    <a:blip r:embed="rId31"/>
+                    <a:stretch>
+                      <a:fillRect/>
+                    </a:stretch>
+                  </pic:blipFill>
+                  <pic:spPr>
+                    <a:xfrm>
+                      <a:off x="0" y="0"/>
+                      <a:ext cx="5731510" cy="2313940"/>
+                    </a:xfrm>
+                    <a:prstGeom prst="rect">
+                      <a:avLst/>
+                    </a:prstGeom>
+                  </pic:spPr>
+                </pic:pic>
+              </a:graphicData>
+            </a:graphic>
+          </wp:inline>
+        </w:drawing>
+      </w:r>
+      <w:r>
+        <w:rPr>
+          <w:noProof/>
+          <w:lang w:val="en-US"/>
+        </w:rPr>
+        <w:drawing>
+          <wp:inline distT="0" distB="0" distL="0" distR="0" wp14:anchorId="1D398B83" wp14:editId="0A17F7A0">
+            <wp:extent cx="5731510" cy="3086735"/>
+            <wp:effectExtent l="0" t="0" r="2540" b="0"/>
+            <wp:docPr id="577907214" name="Imagen 1"/>
+            <wp:cNvGraphicFramePr>
+              <a:graphicFrameLocks xmlns:a="http://schemas.openxmlformats.org/drawingml/2006/main" noChangeAspect="1"/>
+            </wp:cNvGraphicFramePr>
+            <a:graphic xmlns:a="http://schemas.openxmlformats.org/drawingml/2006/main">
+              <a:graphicData uri="http://schemas.openxmlformats.org/drawingml/2006/picture">
+                <pic:pic xmlns:pic="http://schemas.openxmlformats.org/drawingml/2006/picture">
+                  <pic:nvPicPr>
+                    <pic:cNvPr id="577907214" name=""/>
+                    <pic:cNvPicPr/>
+                  </pic:nvPicPr>
+                  <pic:blipFill>
+                    <a:blip r:embed="rId32"/>
+                    <a:stretch>
+                      <a:fillRect/>
+                    </a:stretch>
+                  </pic:blipFill>
+                  <pic:spPr>
+                    <a:xfrm>
+                      <a:off x="0" y="0"/>
+                      <a:ext cx="5731510" cy="3086735"/>
                     </a:xfrm>
                     <a:prstGeom prst="rect">
                       <a:avLst/>
@@ -5953,6 +6321,7 @@
   <w:style w:type="character" w:default="1" w:styleId="Fuentedeprrafopredeter">
     <w:name w:val="Default Paragraph Font"/>
     <w:uiPriority w:val="1"/>
+    <w:semiHidden/>
     <w:unhideWhenUsed/>
   </w:style>
   <w:style w:type="table" w:default="1" w:styleId="Tablanormal">

</xml_diff>

<commit_message>
Lanzamiento Versión 1.4 - Módulo Máquinas, QRs y Mantenimiento Inteligente
</commit_message>
<xml_diff>
--- a/📖 Bitácora de Desarrollo.docx
+++ b/📖 Bitácora de Desarrollo.docx
@@ -1537,7 +1537,7 @@
           <w:lang w:val="en-US"/>
         </w:rPr>
         <w:drawing>
-          <wp:inline distT="0" distB="0" distL="0" distR="0" wp14:anchorId="06CF26DC" wp14:editId="480AAC85">
+          <wp:inline distT="0" distB="0" distL="0" distR="0" wp14:anchorId="06CF26DC" wp14:editId="703F38F2">
             <wp:extent cx="5731510" cy="3344957"/>
             <wp:effectExtent l="0" t="0" r="2540" b="8255"/>
             <wp:docPr id="282286394" name="Imagen 6"/>
@@ -2141,7 +2141,7 @@
         </w:rPr>
         <w:lastRenderedPageBreak/>
         <w:drawing>
-          <wp:inline distT="0" distB="0" distL="0" distR="0" wp14:anchorId="45040CB5" wp14:editId="0BC2B79D">
+          <wp:inline distT="0" distB="0" distL="0" distR="0" wp14:anchorId="45040CB5" wp14:editId="2318248F">
             <wp:extent cx="5629015" cy="2992228"/>
             <wp:effectExtent l="0" t="0" r="0" b="0"/>
             <wp:docPr id="1438918074" name="Imagen 10"/>
@@ -4122,7 +4122,7 @@
           <w:lang w:val="en-US"/>
         </w:rPr>
         <w:drawing>
-          <wp:inline distT="0" distB="0" distL="0" distR="0" wp14:anchorId="79BD094D" wp14:editId="24D7F445">
+          <wp:inline distT="0" distB="0" distL="0" distR="0" wp14:anchorId="79BD094D" wp14:editId="5FB44DC3">
             <wp:extent cx="5754168" cy="1143000"/>
             <wp:effectExtent l="0" t="0" r="0" b="0"/>
             <wp:docPr id="1133662101" name="Imagen 4"/>
@@ -4335,6 +4335,7 @@
       </w:pPr>
       <w:r>
         <w:rPr>
+          <w:noProof/>
           <w:lang w:val="en-US"/>
         </w:rPr>
         <w:lastRenderedPageBreak/>
@@ -4376,6 +4377,7 @@
       </w:r>
       <w:r>
         <w:rPr>
+          <w:noProof/>
           <w:lang w:val="en-US"/>
         </w:rPr>
         <w:drawing>
@@ -4475,7 +4477,6 @@
           <w:noProof/>
           <w:lang w:val="en-US"/>
         </w:rPr>
-        <w:lastRenderedPageBreak/>
         <w:drawing>
           <wp:inline distT="0" distB="0" distL="0" distR="0" wp14:anchorId="4882C00A" wp14:editId="52876CFE">
             <wp:extent cx="5731510" cy="3197860"/>
@@ -4558,6 +4559,7 @@
           <w:noProof/>
           <w:lang w:val="en-US"/>
         </w:rPr>
+        <w:lastRenderedPageBreak/>
         <w:drawing>
           <wp:inline distT="0" distB="0" distL="0" distR="0" wp14:anchorId="1D398B83" wp14:editId="0A17F7A0">
             <wp:extent cx="5731510" cy="3086735"/>
@@ -4593,6 +4595,72 @@
             </a:graphic>
           </wp:inline>
         </w:drawing>
+      </w:r>
+      <w:r>
+        <w:rPr>
+          <w:lang w:val="en-US"/>
+        </w:rPr>
+        <w:drawing>
+          <wp:inline distT="0" distB="0" distL="0" distR="0" wp14:anchorId="60FDF676" wp14:editId="3D00B88A">
+            <wp:extent cx="5731510" cy="2771775"/>
+            <wp:effectExtent l="0" t="0" r="2540" b="9525"/>
+            <wp:docPr id="1373331498" name="Imagen 1"/>
+            <wp:cNvGraphicFramePr>
+              <a:graphicFrameLocks xmlns:a="http://schemas.openxmlformats.org/drawingml/2006/main" noChangeAspect="1"/>
+            </wp:cNvGraphicFramePr>
+            <a:graphic xmlns:a="http://schemas.openxmlformats.org/drawingml/2006/main">
+              <a:graphicData uri="http://schemas.openxmlformats.org/drawingml/2006/picture">
+                <pic:pic xmlns:pic="http://schemas.openxmlformats.org/drawingml/2006/picture">
+                  <pic:nvPicPr>
+                    <pic:cNvPr id="1373331498" name=""/>
+                    <pic:cNvPicPr/>
+                  </pic:nvPicPr>
+                  <pic:blipFill>
+                    <a:blip r:embed="rId33"/>
+                    <a:stretch>
+                      <a:fillRect/>
+                    </a:stretch>
+                  </pic:blipFill>
+                  <pic:spPr>
+                    <a:xfrm>
+                      <a:off x="0" y="0"/>
+                      <a:ext cx="5731510" cy="2771775"/>
+                    </a:xfrm>
+                    <a:prstGeom prst="rect">
+                      <a:avLst/>
+                    </a:prstGeom>
+                  </pic:spPr>
+                </pic:pic>
+              </a:graphicData>
+            </a:graphic>
+          </wp:inline>
+        </w:drawing>
+      </w:r>
+    </w:p>
+    <w:p>
+      <w:pPr>
+        <w:rPr>
+          <w:lang w:val="en-US"/>
+        </w:rPr>
+      </w:pPr>
+      <w:r>
+        <w:rPr>
+          <w:lang w:val="en-US"/>
+        </w:rPr>
+        <w:t>Software SaaS</w:t>
+      </w:r>
+    </w:p>
+    <w:p>
+      <w:pPr>
+        <w:rPr>
+          <w:lang w:val="en-US"/>
+        </w:rPr>
+      </w:pPr>
+      <w:r>
+        <w:rPr>
+          <w:lang w:val="en-US"/>
+        </w:rPr>
+        <w:t>MARKDOWN</w:t>
       </w:r>
     </w:p>
     <w:sectPr>

</xml_diff>